<commit_message>
add @ in id and type label
</commit_message>
<xml_diff>
--- a/CDIFDataDescriptionClasses.docx
+++ b/CDIFDataDescriptionClasses.docx
@@ -22,29 +22,14 @@
           <w:i/>
           <w:iCs/>
         </w:rPr>
-        <w:t>April Fool's Edition</w:t>
+        <w:t>4/10/</w:t>
       </w:r>
       <w:r>
         <w:rPr>
           <w:i/>
           <w:iCs/>
         </w:rPr>
-        <w:t>, 2026</w:t>
-      </w:r>
-    </w:p>
-    <w:p>
-      <w:pPr>
-        <w:rPr>
-          <w:i/>
-          <w:iCs/>
-        </w:rPr>
-      </w:pPr>
-      <w:r>
-        <w:rPr>
-          <w:i/>
-          <w:iCs/>
-        </w:rPr>
-        <w:t>SMR edits</w:t>
+        <w:t>2026</w:t>
       </w:r>
     </w:p>
     <w:p>
@@ -159,7 +144,7 @@
         <w:pStyle w:val="Heading5"/>
       </w:pPr>
       <w:r>
-        <w:t>id</w:t>
+        <w:t>@id</w:t>
       </w:r>
     </w:p>
     <w:p>
@@ -187,10 +172,7 @@
         <w:pStyle w:val="Heading5"/>
       </w:pPr>
       <w:r>
-        <w:t>t</w:t>
-      </w:r>
-      <w:r>
-        <w:t>ype</w:t>
+        <w:t>@type</w:t>
       </w:r>
     </w:p>
     <w:p>
@@ -1871,7 +1853,7 @@
         <w:pStyle w:val="Heading5"/>
       </w:pPr>
       <w:r>
-        <w:t>id</w:t>
+        <w:t>@id</w:t>
       </w:r>
     </w:p>
     <w:p>
@@ -1887,7 +1869,7 @@
         <w:pStyle w:val="Heading5"/>
       </w:pPr>
       <w:r>
-        <w:t>type</w:t>
+        <w:t>@type</w:t>
       </w:r>
     </w:p>
     <w:p>
@@ -2408,10 +2390,7 @@
         <w:pStyle w:val="Heading5"/>
       </w:pPr>
       <w:r>
-        <w:t>t</w:t>
-      </w:r>
-      <w:r>
-        <w:t>ype</w:t>
+        <w:t>@type</w:t>
       </w:r>
     </w:p>
     <w:p>
@@ -2732,7 +2711,7 @@
         <w:pStyle w:val="Heading5"/>
       </w:pPr>
       <w:r>
-        <w:t>id</w:t>
+        <w:t>@id</w:t>
       </w:r>
     </w:p>
     <w:p>
@@ -2763,10 +2742,7 @@
         <w:pStyle w:val="Heading5"/>
       </w:pPr>
       <w:r>
-        <w:t>t</w:t>
-      </w:r>
-      <w:r>
-        <w:t>ype</w:t>
+        <w:t>@type</w:t>
       </w:r>
     </w:p>
     <w:p>
@@ -3103,7 +3079,7 @@
         <w:pStyle w:val="Heading5"/>
       </w:pPr>
       <w:r>
-        <w:t>id</w:t>
+        <w:t>@id</w:t>
       </w:r>
     </w:p>
     <w:p>
@@ -3119,10 +3095,7 @@
         <w:pStyle w:val="Heading5"/>
       </w:pPr>
       <w:r>
-        <w:t>t</w:t>
-      </w:r>
-      <w:r>
-        <w:t>ype</w:t>
+        <w:t>@type</w:t>
       </w:r>
     </w:p>
     <w:p>
@@ -3445,7 +3418,7 @@
         <w:pStyle w:val="Heading5"/>
       </w:pPr>
       <w:r>
-        <w:t>type</w:t>
+        <w:t>@type</w:t>
       </w:r>
     </w:p>
     <w:p>
@@ -3582,7 +3555,7 @@
         <w:pStyle w:val="Heading5"/>
       </w:pPr>
       <w:r>
-        <w:t>type</w:t>
+        <w:t>@type</w:t>
       </w:r>
     </w:p>
     <w:p>
@@ -3709,7 +3682,7 @@
         <w:pStyle w:val="Heading5"/>
       </w:pPr>
       <w:r>
-        <w:t>type</w:t>
+        <w:t>@type</w:t>
       </w:r>
     </w:p>
     <w:p>
@@ -3895,7 +3868,7 @@
         <w:pStyle w:val="Heading5"/>
       </w:pPr>
       <w:r>
-        <w:t>id</w:t>
+        <w:t>@id</w:t>
       </w:r>
     </w:p>
     <w:p>
@@ -3923,7 +3896,7 @@
         <w:pStyle w:val="Heading5"/>
       </w:pPr>
       <w:r>
-        <w:t>type</w:t>
+        <w:t>@type</w:t>
       </w:r>
     </w:p>
     <w:p>
@@ -4178,7 +4151,7 @@
         <w:pStyle w:val="Heading5"/>
       </w:pPr>
       <w:r>
-        <w:t>type</w:t>
+        <w:t>@type</w:t>
       </w:r>
     </w:p>
     <w:p>
@@ -4197,7 +4170,7 @@
         <w:pStyle w:val="Heading5"/>
       </w:pPr>
       <w:r>
-        <w:t>id</w:t>
+        <w:t>@id</w:t>
       </w:r>
     </w:p>
     <w:p>
@@ -4309,7 +4282,7 @@
         <w:pStyle w:val="Heading5"/>
       </w:pPr>
       <w:r>
-        <w:t>type</w:t>
+        <w:t>@type</w:t>
       </w:r>
     </w:p>
     <w:p>
@@ -4343,7 +4316,7 @@
         <w:pStyle w:val="Heading5"/>
       </w:pPr>
       <w:r>
-        <w:t>id</w:t>
+        <w:t>@id</w:t>
       </w:r>
     </w:p>
     <w:p>
@@ -4512,7 +4485,10 @@
         <w:pStyle w:val="Heading5"/>
       </w:pPr>
       <w:r>
-        <w:t>propertyID</w:t>
+        <w:t>property</w:t>
+      </w:r>
+      <w:r>
+        <w:t>@ID</w:t>
       </w:r>
     </w:p>
     <w:p>
@@ -4758,7 +4734,7 @@
         <w:pStyle w:val="Heading5"/>
       </w:pPr>
       <w:r>
-        <w:t>type</w:t>
+        <w:t>@type</w:t>
       </w:r>
     </w:p>
     <w:p>
@@ -5100,7 +5076,7 @@
         <w:pStyle w:val="Heading5"/>
       </w:pPr>
       <w:r>
-        <w:t>type</w:t>
+        <w:t>@type</w:t>
       </w:r>
     </w:p>
     <w:p>
@@ -5273,7 +5249,7 @@
         <w:pStyle w:val="Heading5"/>
       </w:pPr>
       <w:r>
-        <w:t>type</w:t>
+        <w:t>@type</w:t>
       </w:r>
     </w:p>
     <w:p>
@@ -5290,6 +5266,9 @@
       </w:pPr>
       <w:r>
         <w:lastRenderedPageBreak/>
+        <w:t>@</w:t>
+      </w:r>
+      <w:r>
         <w:t>@id</w:t>
       </w:r>
     </w:p>
@@ -5322,7 +5301,10 @@
         <w:pStyle w:val="Heading5"/>
       </w:pPr>
       <w:r>
-        <w:t>cdi:physicalDataType</w:t>
+        <w:t>cdi:physicalData</w:t>
+      </w:r>
+      <w:r>
+        <w:t>Type</w:t>
       </w:r>
     </w:p>
     <w:p>
@@ -5488,7 +5470,7 @@
         <w:pStyle w:val="Heading5"/>
       </w:pPr>
       <w:r>
-        <w:t>type</w:t>
+        <w:t>@type</w:t>
       </w:r>
     </w:p>
     <w:p>
@@ -5563,7 +5545,10 @@
         <w:pStyle w:val="Heading5"/>
       </w:pPr>
       <w:r>
-        <w:t>propertyID</w:t>
+        <w:t>property</w:t>
+      </w:r>
+      <w:r>
+        <w:t>@ID</w:t>
       </w:r>
     </w:p>
     <w:p>
@@ -5606,7 +5591,7 @@
         <w:pStyle w:val="Heading5"/>
       </w:pPr>
       <w:r>
-        <w:t>type</w:t>
+        <w:t>@type</w:t>
       </w:r>
     </w:p>
     <w:p>
@@ -5790,7 +5775,7 @@
         <w:pStyle w:val="Heading5"/>
       </w:pPr>
       <w:r>
-        <w:t>type</w:t>
+        <w:t>@type</w:t>
       </w:r>
     </w:p>
     <w:p>
@@ -5894,7 +5879,7 @@
         <w:pStyle w:val="Heading5"/>
       </w:pPr>
       <w:r>
-        <w:t>type</w:t>
+        <w:t>@type</w:t>
       </w:r>
     </w:p>
     <w:p>
@@ -6061,7 +6046,7 @@
         <w:rPr>
           <w:highlight w:val="white"/>
         </w:rPr>
-        <w:t>type</w:t>
+        <w:t>@type</w:t>
       </w:r>
     </w:p>
     <w:p>
@@ -6241,7 +6226,7 @@
         <w:rPr>
           <w:highlight w:val="white"/>
         </w:rPr>
-        <w:t>type</w:t>
+        <w:t>@type</w:t>
       </w:r>
     </w:p>
     <w:p>
@@ -6563,7 +6548,7 @@
         <w:pStyle w:val="Heading5"/>
       </w:pPr>
       <w:r>
-        <w:t>type</w:t>
+        <w:t>@type</w:t>
       </w:r>
     </w:p>
     <w:p>
@@ -6744,7 +6729,7 @@
         <w:pStyle w:val="Heading5"/>
       </w:pPr>
       <w:r>
-        <w:t>type</w:t>
+        <w:t>@type</w:t>
       </w:r>
     </w:p>
     <w:p>
@@ -6979,7 +6964,7 @@
         <w:pStyle w:val="Heading5"/>
       </w:pPr>
       <w:r>
-        <w:t>type</w:t>
+        <w:t>@type</w:t>
       </w:r>
     </w:p>
     <w:p>
@@ -7109,7 +7094,7 @@
         <w:pStyle w:val="Heading5"/>
       </w:pPr>
       <w:r>
-        <w:t>type</w:t>
+        <w:t>@type</w:t>
       </w:r>
     </w:p>
     <w:p>
@@ -7245,7 +7230,7 @@
         <w:pStyle w:val="Heading5"/>
       </w:pPr>
       <w:r>
-        <w:t>type</w:t>
+        <w:t>@type</w:t>
       </w:r>
     </w:p>
     <w:p>

</xml_diff>